<commit_message>
Update The Great Climb 2026-09-18 15:40
</commit_message>
<xml_diff>
--- a/04 Play Aids/The Great Climb.docx
+++ b/04 Play Aids/The Great Climb.docx
@@ -15,13 +15,8 @@
           <w:sz w:val="50"/>
         </w:rPr>
         <w:t>The Great Climb</w:t>
-      </w:r>
-    </w:p>
-    <w:p>
-      <w:pPr>
-        <w:pStyle w:val="Normal"/>
-        <w:rPr/>
-      </w:pPr>
+        <w:br/>
+      </w:r>
       <w:r>
         <w:rPr>
           <w:i/>
@@ -190,6 +185,46 @@
           <w:sz w:val="17"/>
         </w:rPr>
         <w:t>Climbers on the ascent</w:t>
+        <w:br/>
+        <w:t xml:space="preserve">“Photograph by djovan, via </w:t>
+      </w:r>
+      <w:hyperlink r:id="rId3">
+        <w:r>
+          <w:rPr>
+            <w:rStyle w:val="Style"/>
+            <w:i/>
+            <w:color w:val="315C78"/>
+            <w:sz w:val="17"/>
+          </w:rPr>
+          <w:t>Pixnio</w:t>
+        </w:r>
+      </w:hyperlink>
+      <w:r>
+        <w:rPr>
+          <w:i/>
+          <w:color w:val="555E65"/>
+          <w:sz w:val="17"/>
+        </w:rPr>
+        <w:t xml:space="preserve">, used under the </w:t>
+      </w:r>
+      <w:hyperlink r:id="rId4">
+        <w:r>
+          <w:rPr>
+            <w:rStyle w:val="Style"/>
+            <w:i/>
+            <w:color w:val="315C78"/>
+            <w:sz w:val="17"/>
+          </w:rPr>
+          <w:t>Pixnio License</w:t>
+        </w:r>
+      </w:hyperlink>
+      <w:r>
+        <w:rPr>
+          <w:i/>
+          <w:color w:val="555E65"/>
+          <w:sz w:val="17"/>
+        </w:rPr>
+        <w:t>.”</w:t>
       </w:r>
     </w:p>
     <w:p>
@@ -1189,7 +1224,7 @@
                     </pic:cNvPicPr>
                   </pic:nvPicPr>
                   <pic:blipFill>
-                    <a:blip r:embed="rId3"/>
+                    <a:blip r:embed="rId5"/>
                     <a:stretch>
                       <a:fillRect/>
                     </a:stretch>
@@ -1225,6 +1260,46 @@
           <w:sz w:val="17"/>
         </w:rPr>
         <w:t>A bivouac on the wall</w:t>
+        <w:br/>
+        <w:t xml:space="preserve">“Tenement Flat (1964), photograph by Tom Frost, </w:t>
+      </w:r>
+      <w:hyperlink r:id="rId6">
+        <w:r>
+          <w:rPr>
+            <w:rStyle w:val="Style"/>
+            <w:i/>
+            <w:color w:val="315C78"/>
+            <w:sz w:val="17"/>
+          </w:rPr>
+          <w:t>CC BY 3.0</w:t>
+        </w:r>
+      </w:hyperlink>
+      <w:r>
+        <w:rPr>
+          <w:i/>
+          <w:color w:val="555E65"/>
+          <w:sz w:val="17"/>
+        </w:rPr>
+        <w:t xml:space="preserve">, via </w:t>
+      </w:r>
+      <w:hyperlink r:id="rId7">
+        <w:r>
+          <w:rPr>
+            <w:rStyle w:val="Style"/>
+            <w:i/>
+            <w:color w:val="315C78"/>
+            <w:sz w:val="17"/>
+          </w:rPr>
+          <w:t>Wikimedia Commons</w:t>
+        </w:r>
+      </w:hyperlink>
+      <w:r>
+        <w:rPr>
+          <w:i/>
+          <w:color w:val="555E65"/>
+          <w:sz w:val="17"/>
+        </w:rPr>
+        <w:t>. Converted to WebP.”</w:t>
       </w:r>
     </w:p>
     <w:p>
@@ -2207,7 +2282,7 @@
         <w:rPr/>
         <w:t xml:space="preserve">The Great Climb uses a </w:t>
       </w:r>
-      <w:hyperlink r:id="rId4">
+      <w:hyperlink r:id="rId8">
         <w:r>
           <w:rPr>
             <w:rStyle w:val="Style"/>
@@ -2230,7 +2305,7 @@
         <w:rPr/>
         <w:t xml:space="preserve">The </w:t>
       </w:r>
-      <w:hyperlink r:id="rId5">
+      <w:hyperlink r:id="rId9">
         <w:r>
           <w:rPr>
             <w:rStyle w:val="Style"/>
@@ -2271,432 +2346,6 @@
       </w:pPr>
       <w:r>
         <w:rPr/>
-        <w:t>Photo credits and licenses</w:t>
-      </w:r>
-    </w:p>
-    <w:p>
-      <w:pPr>
-        <w:pStyle w:val="Normal"/>
-        <w:rPr/>
-      </w:pPr>
-      <w:r>
-        <w:rPr/>
-        <w:t xml:space="preserve">These terms apply to the photographs in this folder, not to the text or rules of </w:t>
-      </w:r>
-      <w:r>
-        <w:rPr>
-          <w:i/>
-        </w:rPr>
-        <w:t>The Great Climb</w:t>
-      </w:r>
-      <w:r>
-        <w:rPr/>
-        <w:t>. Keep this note with the images when sharing the vault. Check the linked source pages again before a public or commercial release.</w:t>
-      </w:r>
-    </w:p>
-    <w:p>
-      <w:pPr>
-        <w:pStyle w:val="Heading2"/>
-        <w:rPr/>
-      </w:pPr>
-      <w:r>
-        <w:rPr/>
-        <w:t xml:space="preserve">Tom Frost, </w:t>
-      </w:r>
-      <w:r>
-        <w:rPr>
-          <w:i/>
-        </w:rPr>
-        <w:t>Tenement Flat</w:t>
-      </w:r>
-      <w:r>
-        <w:rPr/>
-        <w:t xml:space="preserve"> (1964)</w:t>
-      </w:r>
-    </w:p>
-    <w:p>
-      <w:pPr>
-        <w:pStyle w:val="ListBullet"/>
-        <w:numPr>
-          <w:ilvl w:val="0"/>
-          <w:numId w:val="1"/>
-        </w:numPr>
-        <w:ind w:hanging="259" w:start="374"/>
-        <w:rPr/>
-      </w:pPr>
-      <w:r>
-        <w:rPr>
-          <w:b/>
-        </w:rPr>
-        <w:t>Local file:</w:t>
-      </w:r>
-      <w:r>
-        <w:rPr/>
-        <w:t xml:space="preserve"> </w:t>
-      </w:r>
-      <w:r>
-        <w:rPr>
-          <w:i/>
-        </w:rPr>
-        <w:t>Portaledge.webp</w:t>
-      </w:r>
-    </w:p>
-    <w:p>
-      <w:pPr>
-        <w:pStyle w:val="ListBullet"/>
-        <w:numPr>
-          <w:ilvl w:val="0"/>
-          <w:numId w:val="1"/>
-        </w:numPr>
-        <w:ind w:hanging="259" w:start="374"/>
-        <w:rPr/>
-      </w:pPr>
-      <w:r>
-        <w:rPr>
-          <w:b/>
-        </w:rPr>
-        <w:t>Photographer and required credit:</w:t>
-      </w:r>
-      <w:r>
-        <w:rPr/>
-        <w:t xml:space="preserve"> Tom Frost.</w:t>
-      </w:r>
-    </w:p>
-    <w:p>
-      <w:pPr>
-        <w:pStyle w:val="ListBullet"/>
-        <w:numPr>
-          <w:ilvl w:val="0"/>
-          <w:numId w:val="1"/>
-        </w:numPr>
-        <w:ind w:hanging="259" w:start="374"/>
-        <w:rPr/>
-      </w:pPr>
-      <w:r>
-        <w:rPr>
-          <w:b/>
-        </w:rPr>
-        <w:t>Source:</w:t>
-      </w:r>
-      <w:r>
-        <w:rPr/>
-        <w:t xml:space="preserve"> </w:t>
-      </w:r>
-      <w:hyperlink r:id="rId6">
-        <w:r>
-          <w:rPr>
-            <w:rStyle w:val="Style"/>
-            <w:color w:val="315C78"/>
-          </w:rPr>
-          <w:t>Wikimedia Commons file page</w:t>
-        </w:r>
-      </w:hyperlink>
-      <w:r>
-        <w:rPr/>
-        <w:t>.</w:t>
-      </w:r>
-    </w:p>
-    <w:p>
-      <w:pPr>
-        <w:pStyle w:val="ListBullet"/>
-        <w:numPr>
-          <w:ilvl w:val="0"/>
-          <w:numId w:val="1"/>
-        </w:numPr>
-        <w:ind w:hanging="259" w:start="374"/>
-        <w:rPr/>
-      </w:pPr>
-      <w:r>
-        <w:rPr>
-          <w:b/>
-        </w:rPr>
-        <w:t>License:</w:t>
-      </w:r>
-      <w:r>
-        <w:rPr/>
-        <w:t xml:space="preserve"> </w:t>
-      </w:r>
-      <w:hyperlink r:id="rId7">
-        <w:r>
-          <w:rPr>
-            <w:rStyle w:val="Style"/>
-            <w:color w:val="315C78"/>
-          </w:rPr>
-          <w:t>Creative Commons Attribution 3.0 Unported (CC BY 3.0)</w:t>
-        </w:r>
-      </w:hyperlink>
-      <w:r>
-        <w:rPr/>
-        <w:t>.</w:t>
-      </w:r>
-    </w:p>
-    <w:p>
-      <w:pPr>
-        <w:pStyle w:val="ListBullet"/>
-        <w:numPr>
-          <w:ilvl w:val="0"/>
-          <w:numId w:val="1"/>
-        </w:numPr>
-        <w:ind w:hanging="259" w:start="374"/>
-        <w:rPr/>
-      </w:pPr>
-      <w:r>
-        <w:rPr>
-          <w:b/>
-        </w:rPr>
-        <w:t>Use:</w:t>
-      </w:r>
-      <w:r>
-        <w:rPr/>
-        <w:t xml:space="preserve"> Sharing and adaptation are allowed, including commercial use. Credit Tom Frost, link to the source and license, and say whether you changed the image. Do not suggest he endorses this game.</w:t>
-      </w:r>
-    </w:p>
-    <w:p>
-      <w:pPr>
-        <w:pStyle w:val="Normal"/>
-        <w:rPr/>
-      </w:pPr>
-      <w:r>
-        <w:rPr/>
-        <w:t>Suggested credit for the local copy: “</w:t>
-      </w:r>
-      <w:r>
-        <w:rPr>
-          <w:i/>
-        </w:rPr>
-        <w:t>Tenement Flat</w:t>
-      </w:r>
-      <w:r>
-        <w:rPr/>
-        <w:t xml:space="preserve"> (1964), photograph by Tom Frost, </w:t>
-      </w:r>
-      <w:hyperlink r:id="rId8">
-        <w:r>
-          <w:rPr>
-            <w:rStyle w:val="Style"/>
-            <w:color w:val="315C78"/>
-          </w:rPr>
-          <w:t>CC BY 3.0</w:t>
-        </w:r>
-      </w:hyperlink>
-      <w:r>
-        <w:rPr/>
-        <w:t xml:space="preserve">, via </w:t>
-      </w:r>
-      <w:hyperlink r:id="rId9">
-        <w:r>
-          <w:rPr>
-            <w:rStyle w:val="Style"/>
-            <w:color w:val="315C78"/>
-          </w:rPr>
-          <w:t>Wikimedia Commons</w:t>
-        </w:r>
-      </w:hyperlink>
-      <w:r>
-        <w:rPr/>
-        <w:t>. Converted to WebP.” If you crop, recolor, or otherwise edit it, describe those changes too.</w:t>
-      </w:r>
-    </w:p>
-    <w:p>
-      <w:pPr>
-        <w:pStyle w:val="Heading2"/>
-        <w:rPr/>
-      </w:pPr>
-      <w:r>
-        <w:rPr/>
-        <w:t>Extreme mountain climbers at exploration of mountain peak</w:t>
-      </w:r>
-    </w:p>
-    <w:p>
-      <w:pPr>
-        <w:pStyle w:val="ListBullet"/>
-        <w:numPr>
-          <w:ilvl w:val="0"/>
-          <w:numId w:val="1"/>
-        </w:numPr>
-        <w:ind w:hanging="259" w:start="374"/>
-        <w:rPr/>
-      </w:pPr>
-      <w:r>
-        <w:rPr>
-          <w:b/>
-        </w:rPr>
-        <w:t>Local file:</w:t>
-      </w:r>
-      <w:r>
-        <w:rPr/>
-        <w:t xml:space="preserve"> </w:t>
-      </w:r>
-      <w:r>
-        <w:rPr>
-          <w:i/>
-        </w:rPr>
-        <w:t>Climb.webp</w:t>
-      </w:r>
-    </w:p>
-    <w:p>
-      <w:pPr>
-        <w:pStyle w:val="ListBullet"/>
-        <w:numPr>
-          <w:ilvl w:val="0"/>
-          <w:numId w:val="1"/>
-        </w:numPr>
-        <w:ind w:hanging="259" w:start="374"/>
-        <w:rPr/>
-      </w:pPr>
-      <w:r>
-        <w:rPr>
-          <w:b/>
-        </w:rPr>
-        <w:t>Photographer:</w:t>
-      </w:r>
-      <w:r>
-        <w:rPr/>
-        <w:t xml:space="preserve"> djovan.</w:t>
-      </w:r>
-    </w:p>
-    <w:p>
-      <w:pPr>
-        <w:pStyle w:val="ListBullet"/>
-        <w:numPr>
-          <w:ilvl w:val="0"/>
-          <w:numId w:val="1"/>
-        </w:numPr>
-        <w:ind w:hanging="259" w:start="374"/>
-        <w:rPr/>
-      </w:pPr>
-      <w:r>
-        <w:rPr>
-          <w:b/>
-        </w:rPr>
-        <w:t>Source:</w:t>
-      </w:r>
-      <w:r>
-        <w:rPr/>
-        <w:t xml:space="preserve"> </w:t>
-      </w:r>
-      <w:hyperlink r:id="rId10">
-        <w:r>
-          <w:rPr>
-            <w:rStyle w:val="Style"/>
-            <w:color w:val="315C78"/>
-          </w:rPr>
-          <w:t>Pixnio image page</w:t>
-        </w:r>
-      </w:hyperlink>
-      <w:r>
-        <w:rPr/>
-        <w:t>.</w:t>
-      </w:r>
-    </w:p>
-    <w:p>
-      <w:pPr>
-        <w:pStyle w:val="ListBullet"/>
-        <w:numPr>
-          <w:ilvl w:val="0"/>
-          <w:numId w:val="1"/>
-        </w:numPr>
-        <w:ind w:hanging="259" w:start="374"/>
-        <w:rPr/>
-      </w:pPr>
-      <w:r>
-        <w:rPr>
-          <w:b/>
-        </w:rPr>
-        <w:t>License:</w:t>
-      </w:r>
-      <w:r>
-        <w:rPr/>
-        <w:t xml:space="preserve"> </w:t>
-      </w:r>
-      <w:hyperlink r:id="rId11">
-        <w:r>
-          <w:rPr>
-            <w:rStyle w:val="Style"/>
-            <w:color w:val="315C78"/>
-          </w:rPr>
-          <w:t>Pixnio License</w:t>
-        </w:r>
-      </w:hyperlink>
-      <w:r>
-        <w:rPr/>
-        <w:t xml:space="preserve">, </w:t>
-      </w:r>
-      <w:r>
-        <w:rPr>
-          <w:b/>
-        </w:rPr>
-        <w:t>not CC0</w:t>
-      </w:r>
-      <w:r>
-        <w:rPr/>
-        <w:t>. The image page identifies this photo as licensed for free use under Pixnio's terms.</w:t>
-      </w:r>
-    </w:p>
-    <w:p>
-      <w:pPr>
-        <w:pStyle w:val="ListBullet"/>
-        <w:numPr>
-          <w:ilvl w:val="0"/>
-          <w:numId w:val="1"/>
-        </w:numPr>
-        <w:ind w:hanging="259" w:start="374"/>
-        <w:rPr/>
-      </w:pPr>
-      <w:r>
-        <w:rPr>
-          <w:b/>
-        </w:rPr>
-        <w:t>Use:</w:t>
-      </w:r>
-      <w:r>
-        <w:rPr/>
-        <w:t xml:space="preserve"> Personal and commercial use and modifications are permitted. Attribution is not required, but is appreciated. Do not resell unmodified copies, redistribute it on a competing stock-photo or wallpaper site, or imply endorsement. Pixnio also warns that separate rights, such as a recognizable person's privacy or publicity rights, may still matter.</w:t>
-      </w:r>
-    </w:p>
-    <w:p>
-      <w:pPr>
-        <w:pStyle w:val="Normal"/>
-        <w:rPr/>
-      </w:pPr>
-      <w:r>
-        <w:rPr/>
-        <w:t xml:space="preserve">Optional credit: “Photograph by djovan, via </w:t>
-      </w:r>
-      <w:hyperlink r:id="rId12">
-        <w:r>
-          <w:rPr>
-            <w:rStyle w:val="Style"/>
-            <w:color w:val="315C78"/>
-          </w:rPr>
-          <w:t>Pixnio</w:t>
-        </w:r>
-      </w:hyperlink>
-      <w:r>
-        <w:rPr/>
-        <w:t xml:space="preserve">, used under the </w:t>
-      </w:r>
-      <w:hyperlink r:id="rId13">
-        <w:r>
-          <w:rPr>
-            <w:rStyle w:val="Style"/>
-            <w:color w:val="315C78"/>
-          </w:rPr>
-          <w:t>Pixnio License</w:t>
-        </w:r>
-      </w:hyperlink>
-      <w:r>
-        <w:rPr/>
-        <w:t>.”</w:t>
-      </w:r>
-    </w:p>
-    <w:p>
-      <w:pPr>
-        <w:pStyle w:val="Heading2"/>
-        <w:rPr/>
-      </w:pPr>
-      <w:r>
-        <w:rPr/>
         <w:t>The Great Climb License</w:t>
       </w:r>
     </w:p>
@@ -2743,108 +2392,24 @@
     <w:p>
       <w:pPr>
         <w:pStyle w:val="Normal"/>
+        <w:widowControl/>
+        <w:bidi w:val="0"/>
+        <w:spacing w:lineRule="auto" w:line="271" w:before="0" w:after="140"/>
+        <w:jc w:val="start"/>
         <w:rPr/>
       </w:pPr>
       <w:r>
         <w:rPr/>
         <w:t>Full legal code: https://creativecommons.org/licenses/by-nc/4.0/legalcode</w:t>
-      </w:r>
-    </w:p>
-    <w:p>
-      <w:pPr>
-        <w:pStyle w:val="Normal"/>
-        <w:rPr/>
-      </w:pPr>
-      <w:r>
-        <w:rPr/>
-        <w:t>The Great Climb name and associated logos are not licensed for use as trademarks or to imply endorsement.</w:t>
-      </w:r>
-    </w:p>
-    <w:p>
-      <w:pPr>
-        <w:pStyle w:val="Normal"/>
-        <w:rPr/>
-      </w:pPr>
-      <w:r>
-        <w:rPr/>
-        <w:t>Third-party software and material retain their respective licenses. In particular:</w:t>
-      </w:r>
-    </w:p>
-    <w:p>
-      <w:pPr>
-        <w:pStyle w:val="ListBullet"/>
-        <w:numPr>
-          <w:ilvl w:val="0"/>
-          <w:numId w:val="1"/>
-        </w:numPr>
-        <w:ind w:hanging="259" w:start="374"/>
-        <w:rPr/>
-      </w:pPr>
-      <w:r>
-        <w:rPr/>
-        <w:t>The web reader code and copied template components retain their MIT notice in assets/reader-license.txt.</w:t>
-      </w:r>
-    </w:p>
-    <w:p>
-      <w:pPr>
-        <w:pStyle w:val="ListBullet"/>
-        <w:numPr>
-          <w:ilvl w:val="0"/>
-          <w:numId w:val="1"/>
-        </w:numPr>
-        <w:ind w:hanging="259" w:start="374"/>
-        <w:rPr/>
-      </w:pPr>
-      <w:r>
-        <w:rPr/>
-        <w:t xml:space="preserve">The photographs in </w:t>
-      </w:r>
-      <w:r>
-        <w:rPr>
-          <w:rFonts w:ascii="Consolas" w:hAnsi="Consolas"/>
-          <w:sz w:val="18"/>
-        </w:rPr>
-        <w:t>Art</w:t>
-      </w:r>
-      <w:r>
-        <w:rPr/>
-        <w:t xml:space="preserve"> are </w:t>
-      </w:r>
-      <w:r>
-        <w:rPr>
-          <w:b/>
-        </w:rPr>
-        <w:t>not</w:t>
-      </w:r>
-      <w:r>
-        <w:rPr/>
-        <w:t xml:space="preserve"> covered by this CC BY-NC license. Their credits and separate terms are in Art/Photo Credits and Licenses.md.</w:t>
-      </w:r>
-    </w:p>
-    <w:p>
-      <w:pPr>
-        <w:pStyle w:val="ListBullet"/>
-        <w:numPr>
-          <w:ilvl w:val="0"/>
-          <w:numId w:val="1"/>
-        </w:numPr>
-        <w:spacing w:before="0" w:after="80"/>
-        <w:ind w:hanging="259" w:start="374"/>
-        <w:contextualSpacing/>
-        <w:rPr/>
-      </w:pPr>
-      <w:r>
-        <w:rPr/>
-        <w:t>STEPS and its physical components are not part of this license. See About the Components.md.</w:t>
       </w:r>
     </w:p>
     <w:sectPr>
-      <w:headerReference w:type="even" r:id="rId14"/>
-      <w:headerReference w:type="default" r:id="rId15"/>
-      <w:headerReference w:type="first" r:id="rId16"/>
-      <w:footerReference w:type="even" r:id="rId17"/>
-      <w:footerReference w:type="default" r:id="rId18"/>
-      <w:footerReference w:type="first" r:id="rId19"/>
+      <w:headerReference w:type="even" r:id="rId10"/>
+      <w:headerReference w:type="default" r:id="rId11"/>
+      <w:headerReference w:type="first" r:id="rId12"/>
+      <w:footerReference w:type="even" r:id="rId13"/>
+      <w:footerReference w:type="default" r:id="rId14"/>
+      <w:footerReference w:type="first" r:id="rId15"/>
       <w:type w:val="nextPage"/>
       <w:pgSz w:w="12240" w:h="15840"/>
       <w:pgMar w:left="1238" w:right="1238" w:gutter="0" w:header="504" w:top="1123" w:footer="504" w:bottom="1008"/>
@@ -2908,7 +2473,7 @@
       <w:rPr>
         <w:shd w:fill="auto" w:val="clear"/>
       </w:rPr>
-      <w:t>8</w:t>
+      <w:t>7</w:t>
     </w:r>
     <w:r>
       <w:rPr>
@@ -2957,7 +2522,7 @@
       <w:rPr>
         <w:shd w:fill="auto" w:val="clear"/>
       </w:rPr>
-      <w:t>8</w:t>
+      <w:t>7</w:t>
     </w:r>
     <w:r>
       <w:rPr>

</xml_diff>